<commit_message>
Added JavaDoc to current
</commit_message>
<xml_diff>
--- a/src/Rapport/MappeRapport_2025_AdrianBalunan.docx
+++ b/src/Rapport/MappeRapport_2025_AdrianBalunan.docx
@@ -402,10 +402,15 @@
             </w:tcBorders>
           </w:tcPr>
           <w:p>
+            <w:pPr>
+              <w:tabs>
+                <w:tab w:val="left" w:pos="2171"/>
+              </w:tabs>
+            </w:pPr>
             <w:bookmarkStart w:id="8" w:name="Tittel2"/>
             <w:bookmarkEnd w:id="8"/>
             <w:r>
-              <w:t>Dagbok innlegg</w:t>
+              <w:t>Sportsdagbok</w:t>
             </w:r>
           </w:p>
         </w:tc>
@@ -494,7 +499,15 @@
               <w:pStyle w:val="Comment"/>
             </w:pPr>
             <w:r>
-              <w:t>Sammendraget skal kunne leses isolert, uten at man behøver å ha kjennskap til rapporten forøvrig.</w:t>
+              <w:t xml:space="preserve">Sammendraget skal kunne leses isolert, uten at man behøver å ha kjennskap til rapporten </w:t>
+            </w:r>
+            <w:proofErr w:type="gramStart"/>
+            <w:r>
+              <w:t>forøvrig</w:t>
+            </w:r>
+            <w:proofErr w:type="gramEnd"/>
+            <w:r>
+              <w:t>.</w:t>
             </w:r>
           </w:p>
         </w:tc>
@@ -1023,7 +1036,15 @@
               <w:t>Tekstgenerering</w:t>
             </w:r>
             <w:r>
-              <w:t>.  Er deler av teksten generert av:</w:t>
+              <w:t xml:space="preserve">.  Er deler av teksten </w:t>
+            </w:r>
+            <w:proofErr w:type="gramStart"/>
+            <w:r>
+              <w:t>generert</w:t>
+            </w:r>
+            <w:proofErr w:type="gramEnd"/>
+            <w:r>
+              <w:t xml:space="preserve"> av:</w:t>
             </w:r>
             <w:r>
               <w:br/>
@@ -1220,7 +1241,23 @@
                 <w:i/>
                 <w:iCs/>
               </w:rPr>
-              <w:t xml:space="preserve">, Google Bard, Bing chat, </w:t>
+              <w:t xml:space="preserve">, Google Bard, Bing </w:t>
+            </w:r>
+            <w:proofErr w:type="gramStart"/>
+            <w:r>
+              <w:rPr>
+                <w:i/>
+                <w:iCs/>
+              </w:rPr>
+              <w:t>chat</w:t>
+            </w:r>
+            <w:proofErr w:type="gramEnd"/>
+            <w:r>
+              <w:rPr>
+                <w:i/>
+                <w:iCs/>
+              </w:rPr>
+              <w:t xml:space="preserve">, </w:t>
             </w:r>
             <w:proofErr w:type="spellStart"/>
             <w:r>
@@ -1243,7 +1280,15 @@
         <w:pStyle w:val="KI-Brdtekst"/>
       </w:pPr>
       <w:r>
-        <w:t>Hvis ja til anvendelse av et tekstverktøy - spesifiser bruken her:</w:t>
+        <w:t xml:space="preserve">Hvis ja til </w:t>
+      </w:r>
+      <w:proofErr w:type="gramStart"/>
+      <w:r>
+        <w:t>anvendelse</w:t>
+      </w:r>
+      <w:proofErr w:type="gramEnd"/>
+      <w:r>
+        <w:t xml:space="preserve"> av et tekstverktøy - spesifiser bruken her:</w:t>
       </w:r>
     </w:p>
     <w:tbl>
@@ -1280,6 +1325,7 @@
               <w:t>extensions</w:t>
             </w:r>
             <w:proofErr w:type="spellEnd"/>
+            <w:proofErr w:type="gramStart"/>
             <w:r>
               <w:t>:</w:t>
             </w:r>
@@ -1290,7 +1336,11 @@
               <w:t>”</w:t>
             </w:r>
             <w:r>
-              <w:t xml:space="preserve">Code </w:t>
+              <w:t>Code</w:t>
+            </w:r>
+            <w:proofErr w:type="gramEnd"/>
+            <w:r>
+              <w:t xml:space="preserve"> </w:t>
             </w:r>
             <w:r>
               <w:t xml:space="preserve">Spell Checker” for å sjekke om all koden er i </w:t>
@@ -1401,7 +1451,15 @@
               <w:t>/</w:t>
             </w:r>
             <w:r>
-              <w:t xml:space="preserve">algoritmene som i) fremtrer direkte i rapporten eller ii) har blitt anvendt for produksjon av resultater slik som figurer, tabeller eller tallverdier blitt generert av: </w:t>
+              <w:t xml:space="preserve">algoritmene som i) fremtrer direkte i rapporten eller ii) har blitt anvendt for produksjon av resultater slik som figurer, tabeller eller tallverdier blitt </w:t>
+            </w:r>
+            <w:proofErr w:type="gramStart"/>
+            <w:r>
+              <w:t>generert</w:t>
+            </w:r>
+            <w:proofErr w:type="gramEnd"/>
+            <w:r>
+              <w:t xml:space="preserve"> av: </w:t>
             </w:r>
             <w:r>
               <w:rPr>
@@ -1561,9 +1619,11 @@
         </w:rPr>
         <w:t xml:space="preserve"> </w:t>
       </w:r>
+      <w:proofErr w:type="gramStart"/>
       <w:r>
         <w:t>anvendelse</w:t>
       </w:r>
+      <w:proofErr w:type="gramEnd"/>
       <w:r>
         <w:rPr>
           <w:spacing w:val="10"/>
@@ -1753,7 +1813,31 @@
               <w:rPr>
                 <w:spacing w:val="-4"/>
               </w:rPr>
-              <w:t xml:space="preserve"> sluttet 25.10.2025, har brukt den siden da)</w:t>
+              <w:t xml:space="preserve"> sluttet </w:t>
+            </w:r>
+            <w:r>
+              <w:rPr>
+                <w:spacing w:val="-4"/>
+              </w:rPr>
+              <w:t>14</w:t>
+            </w:r>
+            <w:r>
+              <w:rPr>
+                <w:spacing w:val="-4"/>
+              </w:rPr>
+              <w:t>.1</w:t>
+            </w:r>
+            <w:r>
+              <w:rPr>
+                <w:spacing w:val="-4"/>
+              </w:rPr>
+              <w:t>1</w:t>
+            </w:r>
+            <w:r>
+              <w:rPr>
+                <w:spacing w:val="-4"/>
+              </w:rPr>
+              <w:t>.2025)</w:t>
             </w:r>
           </w:p>
         </w:tc>
@@ -1843,7 +1927,21 @@
               <w:rPr>
                 <w:rFonts w:eastAsiaTheme="minorHAnsi"/>
               </w:rPr>
-              <w:t>figurene i rapporten blitt generert av:</w:t>
+              <w:t xml:space="preserve">figurene i rapporten blitt </w:t>
+            </w:r>
+            <w:proofErr w:type="gramStart"/>
+            <w:r>
+              <w:rPr>
+                <w:rFonts w:eastAsiaTheme="minorHAnsi"/>
+              </w:rPr>
+              <w:t>generert</w:t>
+            </w:r>
+            <w:proofErr w:type="gramEnd"/>
+            <w:r>
+              <w:rPr>
+                <w:rFonts w:eastAsiaTheme="minorHAnsi"/>
+              </w:rPr>
+              <w:t xml:space="preserve"> av:</w:t>
             </w:r>
             <w:r>
               <w:rPr>
@@ -1958,7 +2056,15 @@
         <w:pStyle w:val="KI-Brdtekst"/>
       </w:pPr>
       <w:r>
-        <w:t>Hvis ja til anvendelse av et bildeverktøy - spesifiser bruken her:</w:t>
+        <w:t xml:space="preserve">Hvis ja til </w:t>
+      </w:r>
+      <w:proofErr w:type="gramStart"/>
+      <w:r>
+        <w:t>anvendelse</w:t>
+      </w:r>
+      <w:proofErr w:type="gramEnd"/>
+      <w:r>
+        <w:t xml:space="preserve"> av et bildeverktøy - spesifiser bruken her:</w:t>
       </w:r>
     </w:p>
     <w:tbl>
@@ -2174,26 +2280,50 @@
                 <w:i/>
                 <w:iCs/>
               </w:rPr>
-              <w:t xml:space="preserve">Det er ikke tillatt å generere besvarelse ved hjelp av kunstig </w:t>
-            </w:r>
-            <w:proofErr w:type="spellStart"/>
+              <w:t xml:space="preserve">Det er ikke tillatt å </w:t>
+            </w:r>
+            <w:proofErr w:type="gramStart"/>
             <w:r>
               <w:rPr>
                 <w:i/>
                 <w:iCs/>
               </w:rPr>
-              <w:t>intelli</w:t>
-            </w:r>
-            <w:proofErr w:type="spellEnd"/>
+              <w:t>generere</w:t>
+            </w:r>
+            <w:proofErr w:type="gramEnd"/>
             <w:r>
               <w:rPr>
                 <w:i/>
                 <w:iCs/>
               </w:rPr>
+              <w:t xml:space="preserve"> besvarelse ved hjelp av kunstig </w:t>
+            </w:r>
+            <w:proofErr w:type="spellStart"/>
+            <w:r>
+              <w:rPr>
+                <w:i/>
+                <w:iCs/>
+              </w:rPr>
+              <w:t>intelli</w:t>
+            </w:r>
+            <w:proofErr w:type="spellEnd"/>
+            <w:r>
+              <w:rPr>
+                <w:i/>
+                <w:iCs/>
+              </w:rPr>
               <w:t>- gens og levere den helt eller delvis som egen besvarelse.</w:t>
             </w:r>
             <w:r>
-              <w:t xml:space="preserve"> Jeg har derfor redegjort for all anvendelse av kunstig intelligens enten i) direkte i rapporten eller ii) i dette skjemaet</w:t>
+              <w:t xml:space="preserve"> Jeg har derfor redegjort for all </w:t>
+            </w:r>
+            <w:proofErr w:type="gramStart"/>
+            <w:r>
+              <w:t>anvendelse</w:t>
+            </w:r>
+            <w:proofErr w:type="gramEnd"/>
+            <w:r>
+              <w:t xml:space="preserve"> av kunstig intelligens enten i) direkte i rapporten eller ii) i dette skjemaet</w:t>
             </w:r>
           </w:p>
         </w:tc>
@@ -2216,44 +2346,26 @@
         <w:jc w:val="center"/>
         <w:rPr>
           <w:sz w:val="20"/>
-          <w:lang w:val="da-DK"/>
         </w:rPr>
       </w:pPr>
       <w:r>
         <w:rPr>
           <w:sz w:val="20"/>
-          <w:lang w:val="da-DK"/>
-        </w:rPr>
-        <w:t>Adrian P</w:t>
-      </w:r>
-      <w:r>
-        <w:rPr>
-          <w:sz w:val="20"/>
-          <w:lang w:val="da-DK"/>
-        </w:rPr>
-        <w:t>aul Limpiado Balunan / 05.11.2025 / Trondheim</w:t>
+        </w:rPr>
+        <w:t>Adrian Paul Limpiado Balunan / 05.11.2025 / Trondheim</w:t>
       </w:r>
     </w:p>
     <w:p>
       <w:pPr>
         <w:pStyle w:val="KI-Underskrift"/>
-        <w:rPr>
-          <w:lang w:val="da-DK"/>
-        </w:rPr>
-      </w:pPr>
-      <w:r>
-        <w:rPr>
-          <w:lang w:val="da-DK"/>
-        </w:rPr>
+      </w:pPr>
+      <w:r>
         <w:t>Underskrift/Dato/Sted</w:t>
       </w:r>
     </w:p>
     <w:p>
       <w:pPr>
         <w:pStyle w:val="Title"/>
-        <w:rPr>
-          <w:lang w:val="da-DK"/>
-        </w:rPr>
       </w:pPr>
     </w:p>
     <w:p>
@@ -2265,13 +2377,9 @@
           <w:kern w:val="28"/>
           <w:sz w:val="32"/>
           <w:szCs w:val="32"/>
-          <w:lang w:val="da-DK"/>
-        </w:rPr>
-      </w:pPr>
-      <w:r>
-        <w:rPr>
-          <w:lang w:val="da-DK"/>
-        </w:rPr>
+        </w:rPr>
+      </w:pPr>
+      <w:r>
         <w:br w:type="page"/>
       </w:r>
     </w:p>
@@ -4627,7 +4735,15 @@
       </w:r>
       <w:r>
         <w:tab/>
-        <w:t>Standard tekst i et avsnitt. Benytt denne for all ”vanlig” tekst</w:t>
+        <w:t xml:space="preserve">Standard tekst i et avsnitt. Benytt denne for </w:t>
+      </w:r>
+      <w:proofErr w:type="gramStart"/>
+      <w:r>
+        <w:t>all ”vanlig</w:t>
+      </w:r>
+      <w:proofErr w:type="gramEnd"/>
+      <w:r>
+        <w:t>” tekst</w:t>
       </w:r>
     </w:p>
     <w:p>
@@ -4639,7 +4755,15 @@
       </w:r>
       <w:r>
         <w:tab/>
-        <w:t>Benyttes hovedsakelig i avsnittet ”TERMINOLOGI”</w:t>
+        <w:t xml:space="preserve">Benyttes hovedsakelig i </w:t>
+      </w:r>
+      <w:proofErr w:type="gramStart"/>
+      <w:r>
+        <w:t>avsnittet ”TERMINOLOGI</w:t>
+      </w:r>
+      <w:proofErr w:type="gramEnd"/>
+      <w:r>
+        <w:t>”</w:t>
       </w:r>
     </w:p>
     <w:p>
@@ -6042,7 +6166,21 @@
               <w:rPr>
                 <w:color w:val="auto"/>
               </w:rPr>
-              <w:t xml:space="preserve">som fokuserer </w:t>
+              <w:t xml:space="preserve">som </w:t>
+            </w:r>
+            <w:proofErr w:type="gramStart"/>
+            <w:r>
+              <w:rPr>
+                <w:color w:val="auto"/>
+              </w:rPr>
+              <w:t>fokuserer</w:t>
+            </w:r>
+            <w:proofErr w:type="gramEnd"/>
+            <w:r>
+              <w:rPr>
+                <w:color w:val="auto"/>
+              </w:rPr>
+              <w:t xml:space="preserve"> </w:t>
             </w:r>
             <w:r>
               <w:rPr>
@@ -6664,11 +6802,13 @@
               <w:pStyle w:val="Comment"/>
               <w:rPr>
                 <w:color w:val="auto"/>
+                <w:lang w:val="fi-FI"/>
               </w:rPr>
             </w:pPr>
             <w:r>
               <w:rPr>
                 <w:color w:val="auto"/>
+                <w:lang w:val="fi-FI"/>
               </w:rPr>
               <w:t xml:space="preserve">Java </w:t>
             </w:r>
@@ -6676,6 +6816,7 @@
             <w:r>
               <w:rPr>
                 <w:color w:val="auto"/>
+                <w:lang w:val="fi-FI"/>
               </w:rPr>
               <w:t>verison</w:t>
             </w:r>
@@ -6683,12 +6824,14 @@
             <w:r>
               <w:rPr>
                 <w:color w:val="auto"/>
+                <w:lang w:val="fi-FI"/>
               </w:rPr>
               <w:t xml:space="preserve"> </w:t>
             </w:r>
             <w:r>
               <w:rPr>
                 <w:color w:val="auto"/>
+                <w:lang w:val="fi-FI"/>
               </w:rPr>
               <w:t>«24.0.2» 2025-07-15</w:t>
             </w:r>
@@ -6698,15 +6841,72 @@
               <w:pStyle w:val="Comment"/>
               <w:rPr>
                 <w:color w:val="auto"/>
-                <w:lang w:val="en-GB"/>
+                <w:lang w:val="fi-FI"/>
               </w:rPr>
             </w:pPr>
+            <w:proofErr w:type="gramStart"/>
             <w:r>
               <w:rPr>
                 <w:color w:val="auto"/>
-                <w:lang w:val="en-GB"/>
-              </w:rPr>
-              <w:t>Java(TM) SE Runtime Environment (build 24.0.2+12-54)</w:t>
+                <w:lang w:val="fi-FI"/>
+              </w:rPr>
+              <w:t>Java(</w:t>
+            </w:r>
+            <w:proofErr w:type="gramEnd"/>
+            <w:r>
+              <w:rPr>
+                <w:color w:val="auto"/>
+                <w:lang w:val="fi-FI"/>
+              </w:rPr>
+              <w:t xml:space="preserve">TM) </w:t>
+            </w:r>
+            <w:proofErr w:type="gramStart"/>
+            <w:r>
+              <w:rPr>
+                <w:color w:val="auto"/>
+                <w:lang w:val="fi-FI"/>
+              </w:rPr>
+              <w:t>SE Runtime Environment</w:t>
+            </w:r>
+            <w:proofErr w:type="gramEnd"/>
+            <w:r>
+              <w:rPr>
+                <w:color w:val="auto"/>
+                <w:lang w:val="fi-FI"/>
+              </w:rPr>
+              <w:t xml:space="preserve"> (</w:t>
+            </w:r>
+            <w:proofErr w:type="spellStart"/>
+            <w:r>
+              <w:rPr>
+                <w:color w:val="auto"/>
+                <w:lang w:val="fi-FI"/>
+              </w:rPr>
+              <w:t>build</w:t>
+            </w:r>
+            <w:proofErr w:type="spellEnd"/>
+            <w:r>
+              <w:rPr>
+                <w:color w:val="auto"/>
+                <w:lang w:val="fi-FI"/>
+              </w:rPr>
+              <w:t xml:space="preserve"> 24.0.2+</w:t>
+            </w:r>
+            <w:proofErr w:type="gramStart"/>
+            <w:r>
+              <w:rPr>
+                <w:color w:val="auto"/>
+                <w:lang w:val="fi-FI"/>
+              </w:rPr>
+              <w:t>12-54</w:t>
+            </w:r>
+            <w:proofErr w:type="gramEnd"/>
+            <w:r>
+              <w:rPr>
+                <w:color w:val="auto"/>
+                <w:lang w:val="fi-FI"/>
+              </w:rPr>
+              <w:t>)</w:t>
             </w:r>
           </w:p>
           <w:p>
@@ -6725,6 +6925,7 @@
               <w:t xml:space="preserve">Java </w:t>
             </w:r>
             <w:proofErr w:type="spellStart"/>
+            <w:proofErr w:type="gramStart"/>
             <w:r>
               <w:rPr>
                 <w:color w:val="auto"/>
@@ -6738,7 +6939,15 @@
                 <w:color w:val="auto"/>
                 <w:lang w:val="en-GB"/>
               </w:rPr>
-              <w:t>(TM) 64-Bit Server VM (build 24.0.2+12-54, mixed mode, sharing)</w:t>
+              <w:t>(</w:t>
+            </w:r>
+            <w:proofErr w:type="gramEnd"/>
+            <w:r>
+              <w:rPr>
+                <w:color w:val="auto"/>
+                <w:lang w:val="en-GB"/>
+              </w:rPr>
+              <w:t>TM) 64-Bit Server VM (build 24.0.2+12-54, mixed mode, sharing)</w:t>
             </w:r>
           </w:p>
         </w:tc>
@@ -6866,13 +7075,7 @@
         <w:pStyle w:val="Caption"/>
       </w:pPr>
       <w:r>
-        <w:t xml:space="preserve">Tabell </w:t>
-      </w:r>
-      <w:r>
-        <w:t>3</w:t>
-      </w:r>
-      <w:r>
-        <w:t xml:space="preserve">, </w:t>
+        <w:t xml:space="preserve">Tabell 3, </w:t>
       </w:r>
       <w:proofErr w:type="spellStart"/>
       <w:r>
@@ -6892,48 +7095,48 @@
       <w:pPr>
         <w:pStyle w:val="Heading1"/>
       </w:pPr>
-      <w:bookmarkStart w:id="40" w:name="_Toc136784290"/>
-      <w:bookmarkStart w:id="41" w:name="_Toc158625722"/>
-      <w:bookmarkStart w:id="42" w:name="_Toc136784288"/>
+      <w:bookmarkStart w:id="40" w:name="_Toc158625722"/>
+      <w:bookmarkStart w:id="41" w:name="_Toc136784288"/>
+      <w:bookmarkStart w:id="42" w:name="_Toc136784290"/>
       <w:r>
         <w:t>Resultat</w:t>
       </w:r>
+      <w:bookmarkEnd w:id="40"/>
+    </w:p>
+    <w:p>
+      <w:pPr>
+        <w:pStyle w:val="Heading2"/>
+      </w:pPr>
+      <w:bookmarkStart w:id="43" w:name="_Toc158625723"/>
+      <w:r>
+        <w:t>Teknisk Design</w:t>
+      </w:r>
       <w:bookmarkEnd w:id="41"/>
+      <w:bookmarkEnd w:id="43"/>
+    </w:p>
+    <w:p>
+      <w:pPr>
+        <w:pStyle w:val="Comment"/>
+      </w:pPr>
+      <w:r>
+        <w:t>[Kapittelet om teknisk design beskriver det store bildet av valgt løsning. For et programvareutviklingsprosjekt vil dette vanligvis inneholde systemarkitekturen (klient-server, sky, databaser, tjenester, desktop-applikasjon osv.); både hvordan det ble løst, og, enda viktigere, hvorfor denne arkitektur ble valgt</w:t>
+      </w:r>
+      <w:r>
+        <w:t>.</w:t>
+      </w:r>
+      <w:r>
+        <w:t>]</w:t>
+      </w:r>
     </w:p>
     <w:p>
       <w:pPr>
         <w:pStyle w:val="Heading2"/>
       </w:pPr>
-      <w:bookmarkStart w:id="43" w:name="_Toc158625723"/>
-      <w:r>
-        <w:t>Teknisk Design</w:t>
+      <w:bookmarkStart w:id="44" w:name="_Toc158625724"/>
+      <w:r>
+        <w:t>Implementasjon</w:t>
       </w:r>
       <w:bookmarkEnd w:id="42"/>
-      <w:bookmarkEnd w:id="43"/>
-    </w:p>
-    <w:p>
-      <w:pPr>
-        <w:pStyle w:val="Comment"/>
-      </w:pPr>
-      <w:r>
-        <w:t>[Kapittelet om teknisk design beskriver det store bildet av valgt løsning. For et programvareutviklingsprosjekt vil dette vanligvis inneholde systemarkitekturen (klient-server, sky, databaser, tjenester, desktop-applikasjon osv.); både hvordan det ble løst, og, enda viktigere, hvorfor denne arkitektur ble valgt</w:t>
-      </w:r>
-      <w:r>
-        <w:t>.</w:t>
-      </w:r>
-      <w:r>
-        <w:t>]</w:t>
-      </w:r>
-    </w:p>
-    <w:p>
-      <w:pPr>
-        <w:pStyle w:val="Heading2"/>
-      </w:pPr>
-      <w:bookmarkStart w:id="44" w:name="_Toc158625724"/>
-      <w:r>
-        <w:t>Implementasjon</w:t>
-      </w:r>
-      <w:bookmarkEnd w:id="40"/>
       <w:bookmarkEnd w:id="44"/>
     </w:p>
     <w:p>
@@ -7231,9 +7434,14 @@
         <w:fldChar w:fldCharType="end"/>
       </w:r>
       <w:r>
-        <w:t xml:space="preserve"> Klassediagram som viser...</w:t>
+        <w:t xml:space="preserve"> Klassediagram som </w:t>
+      </w:r>
+      <w:proofErr w:type="gramStart"/>
+      <w:r>
+        <w:t>viser...</w:t>
       </w:r>
       <w:bookmarkEnd w:id="45"/>
+      <w:proofErr w:type="gramEnd"/>
     </w:p>
     <w:p>
       <w:pPr>
@@ -7333,10 +7541,12 @@
         <w:t xml:space="preserve"> </w:t>
       </w:r>
       <w:proofErr w:type="spellStart"/>
+      <w:proofErr w:type="gramStart"/>
       <w:r>
         <w:t>javafx:run</w:t>
       </w:r>
       <w:proofErr w:type="spellEnd"/>
+      <w:proofErr w:type="gramEnd"/>
       <w:r>
         <w:t>)</w:t>
       </w:r>
@@ -7377,7 +7587,15 @@
         <w:t>[</w:t>
       </w:r>
       <w:r>
-        <w:t xml:space="preserve">Her oppsummerer du/dere oppgaven. Hvor langt kom du/dere (resultat)? Hva fikk du/dere ikke gjort i forhold til oppgaveteksten? Hva var de store utfordringene/problemene du/dere møtte, etc.. </w:t>
+        <w:t xml:space="preserve">Her oppsummerer du/dere oppgaven. Hvor langt kom du/dere (resultat)? Hva fikk du/dere ikke gjort i forhold til oppgaveteksten? Hva var de store utfordringene/problemene du/dere møtte, </w:t>
+      </w:r>
+      <w:proofErr w:type="gramStart"/>
+      <w:r>
+        <w:t>etc..</w:t>
+      </w:r>
+      <w:proofErr w:type="gramEnd"/>
+      <w:r>
+        <w:t xml:space="preserve"> </w:t>
       </w:r>
     </w:p>
     <w:p>
@@ -7395,7 +7613,15 @@
         <w:t>drøfte din egen løsning i forhold til det du har lært om gode prinsipper for design av programvare</w:t>
       </w:r>
       <w:r>
-        <w:t xml:space="preserve"> (robust kode, kodestil, designprinsipper </w:t>
+        <w:t xml:space="preserve"> (</w:t>
+      </w:r>
+      <w:proofErr w:type="gramStart"/>
+      <w:r>
+        <w:t>robust</w:t>
+      </w:r>
+      <w:proofErr w:type="gramEnd"/>
+      <w:r>
+        <w:t xml:space="preserve"> kode, kodestil, designprinsipper </w:t>
       </w:r>
       <w:proofErr w:type="spellStart"/>
       <w:r>
@@ -7467,7 +7693,31 @@
         <w:t>underbygger teoriene om god design</w:t>
       </w:r>
       <w:r>
-        <w:t>: «I klassen ..... har vi valgt å returnere .... fra metoden.... Dette bidrar til lav kobling....»</w:t>
+        <w:t>: «I klassen</w:t>
+      </w:r>
+      <w:proofErr w:type="gramStart"/>
+      <w:r>
+        <w:t xml:space="preserve"> ....</w:t>
+      </w:r>
+      <w:proofErr w:type="gramEnd"/>
+      <w:r>
+        <w:t xml:space="preserve">. har vi valgt å returnere .... fra </w:t>
+      </w:r>
+      <w:proofErr w:type="gramStart"/>
+      <w:r>
+        <w:t>metoden...</w:t>
+      </w:r>
+      <w:proofErr w:type="gramEnd"/>
+      <w:r>
+        <w:t xml:space="preserve">. Dette bidrar til lav </w:t>
+      </w:r>
+      <w:proofErr w:type="gramStart"/>
+      <w:r>
+        <w:t>kobling....</w:t>
+      </w:r>
+      <w:proofErr w:type="gramEnd"/>
+      <w:r>
+        <w:t>»</w:t>
       </w:r>
     </w:p>
     <w:p>
@@ -7761,11 +8011,33 @@
           <w:lang w:val="en-GB"/>
         </w:rPr>
       </w:pPr>
+      <w:proofErr w:type="gramStart"/>
       <w:r>
         <w:rPr>
           <w:lang w:val="en-US"/>
         </w:rPr>
-        <w:t xml:space="preserve">”Objects First With Java”, </w:t>
+        <w:t>”Objects</w:t>
+      </w:r>
+      <w:proofErr w:type="gramEnd"/>
+      <w:r>
+        <w:rPr>
+          <w:lang w:val="en-US"/>
+        </w:rPr>
+        <w:t xml:space="preserve"> First </w:t>
+      </w:r>
+      <w:proofErr w:type="gramStart"/>
+      <w:r>
+        <w:rPr>
+          <w:lang w:val="en-US"/>
+        </w:rPr>
+        <w:t>With</w:t>
+      </w:r>
+      <w:proofErr w:type="gramEnd"/>
+      <w:r>
+        <w:rPr>
+          <w:lang w:val="en-US"/>
+        </w:rPr>
+        <w:t xml:space="preserve"> Java”, </w:t>
       </w:r>
       <w:r>
         <w:rPr>
@@ -10854,9 +11126,12 @@
 </file>
 
 <file path=customXml/item2.xml><?xml version="1.0" encoding="utf-8"?>
-<p:properties xmlns:p="http://schemas.microsoft.com/office/2006/metadata/properties" xmlns:xsi="http://www.w3.org/2001/XMLSchema-instance" xmlns:pc="http://schemas.microsoft.com/office/infopath/2007/PartnerControls">
-  <documentManagement/>
-</p:properties>
+<?mso-contentType ?>
+<FormTemplates xmlns="http://schemas.microsoft.com/sharepoint/v3/contenttype/forms">
+  <Display>DocumentLibraryForm</Display>
+  <Edit>DocumentLibraryForm</Edit>
+  <New>DocumentLibraryForm</New>
+</FormTemplates>
 </file>
 
 <file path=customXml/item3.xml><?xml version="1.0" encoding="utf-8"?>
@@ -10864,12 +11139,9 @@
 </file>
 
 <file path=customXml/item4.xml><?xml version="1.0" encoding="utf-8"?>
-<?mso-contentType ?>
-<FormTemplates xmlns="http://schemas.microsoft.com/sharepoint/v3/contenttype/forms">
-  <Display>DocumentLibraryForm</Display>
-  <Edit>DocumentLibraryForm</Edit>
-  <New>DocumentLibraryForm</New>
-</FormTemplates>
+<p:properties xmlns:p="http://schemas.microsoft.com/office/2006/metadata/properties" xmlns:xsi="http://www.w3.org/2001/XMLSchema-instance" xmlns:pc="http://schemas.microsoft.com/office/infopath/2007/PartnerControls">
+  <documentManagement/>
+</p:properties>
 </file>
 
 <file path=customXml/itemProps1.xml><?xml version="1.0" encoding="utf-8"?>
@@ -10891,10 +11163,9 @@
 </file>
 
 <file path=customXml/itemProps2.xml><?xml version="1.0" encoding="utf-8"?>
-<ds:datastoreItem xmlns:ds="http://schemas.openxmlformats.org/officeDocument/2006/customXml" ds:itemID="{A6536B99-D6B0-4649-9E78-442D9479EEFB}">
+<ds:datastoreItem xmlns:ds="http://schemas.openxmlformats.org/officeDocument/2006/customXml" ds:itemID="{21180466-87E8-4E8F-AEED-10952B93029E}">
   <ds:schemaRefs>
-    <ds:schemaRef ds:uri="http://schemas.microsoft.com/office/2006/metadata/properties"/>
-    <ds:schemaRef ds:uri="http://schemas.microsoft.com/office/infopath/2007/PartnerControls"/>
+    <ds:schemaRef ds:uri="http://schemas.microsoft.com/sharepoint/v3/contenttype/forms"/>
   </ds:schemaRefs>
 </ds:datastoreItem>
 </file>
@@ -10908,9 +11179,10 @@
 </file>
 
 <file path=customXml/itemProps4.xml><?xml version="1.0" encoding="utf-8"?>
-<ds:datastoreItem xmlns:ds="http://schemas.openxmlformats.org/officeDocument/2006/customXml" ds:itemID="{21180466-87E8-4E8F-AEED-10952B93029E}">
+<ds:datastoreItem xmlns:ds="http://schemas.openxmlformats.org/officeDocument/2006/customXml" ds:itemID="{A6536B99-D6B0-4649-9E78-442D9479EEFB}">
   <ds:schemaRefs>
-    <ds:schemaRef ds:uri="http://schemas.microsoft.com/sharepoint/v3/contenttype/forms"/>
+    <ds:schemaRef ds:uri="http://schemas.microsoft.com/office/2006/metadata/properties"/>
+    <ds:schemaRef ds:uri="http://schemas.microsoft.com/office/infopath/2007/PartnerControls"/>
   </ds:schemaRefs>
 </ds:datastoreItem>
 </file>
</xml_diff>